<commit_message>
update doc/project build.docx, add owtoolchain. zip downloading url
</commit_message>
<xml_diff>
--- a/doc/project build.docx
+++ b/doc/project build.docx
@@ -63,9 +63,6 @@
           <w:ilvl w:val="0"/>
           <w:numId w:val="1"/>
         </w:numPr>
-        <w:rPr>
-          <w:rFonts w:hint="eastAsia"/>
-        </w:rPr>
       </w:pPr>
       <w:r>
         <w:t>1.</w:t>
@@ -76,6 +73,50 @@
         </w:rPr>
         <w:t xml:space="preserve"> compilation environment</w:t>
       </w:r>
+    </w:p>
+    <w:p>
+      <w:pPr>
+        <w:pStyle w:val="a9"/>
+        <w:ind w:left="360"/>
+      </w:pPr>
+    </w:p>
+    <w:p>
+      <w:pPr>
+        <w:pStyle w:val="a9"/>
+        <w:ind w:left="360"/>
+        <w:rPr>
+          <w:rFonts w:hint="eastAsia"/>
+        </w:rPr>
+      </w:pPr>
+      <w:r>
+        <w:t xml:space="preserve">Please visit the following address to download the compilation chain package "owtoolchain.zip" </w:t>
+      </w:r>
+    </w:p>
+    <w:p>
+      <w:pPr>
+        <w:pStyle w:val="a9"/>
+        <w:ind w:left="360"/>
+        <w:rPr>
+          <w:rFonts w:hint="eastAsia"/>
+        </w:rPr>
+      </w:pPr>
+      <w:hyperlink r:id="rId7" w:history="1">
+        <w:r>
+          <w:rPr>
+            <w:rStyle w:val="af2"/>
+          </w:rPr>
+          <w:t>https://drive.google.com/file/d/1yVfltWdgUpjrMy-ondYa0T5ihrqVkj3v/view?usp=sharing</w:t>
+        </w:r>
+      </w:hyperlink>
+    </w:p>
+    <w:p>
+      <w:pPr>
+        <w:pStyle w:val="a9"/>
+        <w:ind w:left="360"/>
+        <w:rPr>
+          <w:rFonts w:hint="eastAsia"/>
+        </w:rPr>
+      </w:pPr>
     </w:p>
     <w:p>
       <w:pPr>
@@ -179,7 +220,7 @@
                     </pic:cNvPicPr>
                   </pic:nvPicPr>
                   <pic:blipFill>
-                    <a:blip r:embed="rId7">
+                    <a:blip r:embed="rId8">
                       <a:extLst>
                         <a:ext uri="{28A0092B-C50C-407E-A947-70E740481C1C}">
                           <a14:useLocalDpi xmlns:a14="http://schemas.microsoft.com/office/drawing/2010/main" val="0"/>
@@ -241,7 +282,7 @@
                     </pic:cNvPicPr>
                   </pic:nvPicPr>
                   <pic:blipFill>
-                    <a:blip r:embed="rId8">
+                    <a:blip r:embed="rId9">
                       <a:extLst>
                         <a:ext uri="{28A0092B-C50C-407E-A947-70E740481C1C}">
                           <a14:useLocalDpi xmlns:a14="http://schemas.microsoft.com/office/drawing/2010/main" val="0"/>
@@ -319,7 +360,6 @@
         <w:rPr>
           <w:noProof/>
         </w:rPr>
-        <w:lastRenderedPageBreak/>
         <w:drawing>
           <wp:inline distT="0" distB="0" distL="0" distR="0" wp14:anchorId="5D7EF79E" wp14:editId="3DBB5453">
             <wp:extent cx="5274310" cy="1789430"/>
@@ -338,7 +378,7 @@
                     </pic:cNvPicPr>
                   </pic:nvPicPr>
                   <pic:blipFill>
-                    <a:blip r:embed="rId9">
+                    <a:blip r:embed="rId10">
                       <a:extLst>
                         <a:ext uri="{28A0092B-C50C-407E-A947-70E740481C1C}">
                           <a14:useLocalDpi xmlns:a14="http://schemas.microsoft.com/office/drawing/2010/main" val="0"/>
@@ -396,7 +436,7 @@
           <w:noProof/>
         </w:rPr>
         <w:drawing>
-          <wp:inline distT="0" distB="0" distL="0" distR="0" wp14:anchorId="69620DDB" wp14:editId="5FBC2580">
+          <wp:inline distT="0" distB="0" distL="0" distR="0" wp14:anchorId="69620DDB" wp14:editId="7B4F17D7">
             <wp:extent cx="5274310" cy="1951990"/>
             <wp:effectExtent l="0" t="0" r="2540" b="0"/>
             <wp:docPr id="1442360609" name="图片 2"/>
@@ -413,7 +453,7 @@
                     </pic:cNvPicPr>
                   </pic:nvPicPr>
                   <pic:blipFill>
-                    <a:blip r:embed="rId10" cstate="print">
+                    <a:blip r:embed="rId11" cstate="print">
                       <a:extLst>
                         <a:ext uri="{28A0092B-C50C-407E-A947-70E740481C1C}">
                           <a14:useLocalDpi xmlns:a14="http://schemas.microsoft.com/office/drawing/2010/main" val="0"/>
@@ -485,7 +525,7 @@
           <w:noProof/>
         </w:rPr>
         <w:drawing>
-          <wp:inline distT="0" distB="0" distL="0" distR="0" wp14:anchorId="07CEF12B" wp14:editId="3C994A17">
+          <wp:inline distT="0" distB="0" distL="0" distR="0" wp14:anchorId="07CEF12B" wp14:editId="0FB70532">
             <wp:extent cx="5274310" cy="1900555"/>
             <wp:effectExtent l="0" t="0" r="2540" b="4445"/>
             <wp:docPr id="668160566" name="图片 3"/>
@@ -502,7 +542,7 @@
                     </pic:cNvPicPr>
                   </pic:nvPicPr>
                   <pic:blipFill>
-                    <a:blip r:embed="rId11" cstate="print">
+                    <a:blip r:embed="rId12" cstate="print">
                       <a:extLst>
                         <a:ext uri="{28A0092B-C50C-407E-A947-70E740481C1C}">
                           <a14:useLocalDpi xmlns:a14="http://schemas.microsoft.com/office/drawing/2010/main" val="0"/>
@@ -589,7 +629,7 @@
                     </pic:cNvPicPr>
                   </pic:nvPicPr>
                   <pic:blipFill>
-                    <a:blip r:embed="rId12">
+                    <a:blip r:embed="rId13">
                       <a:extLst>
                         <a:ext uri="{28A0092B-C50C-407E-A947-70E740481C1C}">
                           <a14:useLocalDpi xmlns:a14="http://schemas.microsoft.com/office/drawing/2010/main" val="0"/>
@@ -658,7 +698,7 @@
           <w:noProof/>
         </w:rPr>
         <w:drawing>
-          <wp:inline distT="0" distB="0" distL="0" distR="0" wp14:anchorId="2FD9DA7D" wp14:editId="4A6916B7">
+          <wp:inline distT="0" distB="0" distL="0" distR="0" wp14:anchorId="2FD9DA7D" wp14:editId="2E9B1D12">
             <wp:extent cx="5274310" cy="2552065"/>
             <wp:effectExtent l="0" t="0" r="2540" b="635"/>
             <wp:docPr id="1347873146" name="图片 5"/>
@@ -675,7 +715,7 @@
                     </pic:cNvPicPr>
                   </pic:nvPicPr>
                   <pic:blipFill>
-                    <a:blip r:embed="rId13" cstate="print">
+                    <a:blip r:embed="rId14" cstate="print">
                       <a:extLst>
                         <a:ext uri="{28A0092B-C50C-407E-A947-70E740481C1C}">
                           <a14:useLocalDpi xmlns:a14="http://schemas.microsoft.com/office/drawing/2010/main" val="0"/>
@@ -748,7 +788,7 @@
                     </pic:cNvPicPr>
                   </pic:nvPicPr>
                   <pic:blipFill>
-                    <a:blip r:embed="rId14">
+                    <a:blip r:embed="rId15">
                       <a:extLst>
                         <a:ext uri="{28A0092B-C50C-407E-A947-70E740481C1C}">
                           <a14:useLocalDpi xmlns:a14="http://schemas.microsoft.com/office/drawing/2010/main" val="0"/>
@@ -822,7 +862,7 @@
                     </pic:cNvPicPr>
                   </pic:nvPicPr>
                   <pic:blipFill>
-                    <a:blip r:embed="rId15">
+                    <a:blip r:embed="rId16">
                       <a:extLst>
                         <a:ext uri="{28A0092B-C50C-407E-A947-70E740481C1C}">
                           <a14:useLocalDpi xmlns:a14="http://schemas.microsoft.com/office/drawing/2010/main" val="0"/>
@@ -878,7 +918,7 @@
           <w:noProof/>
         </w:rPr>
         <w:drawing>
-          <wp:inline distT="0" distB="0" distL="0" distR="0" wp14:anchorId="6639FE01" wp14:editId="212CB003">
+          <wp:inline distT="0" distB="0" distL="0" distR="0" wp14:anchorId="6639FE01" wp14:editId="0C839295">
             <wp:extent cx="5274310" cy="1701165"/>
             <wp:effectExtent l="0" t="0" r="2540" b="0"/>
             <wp:docPr id="875427755" name="图片 8"/>
@@ -895,7 +935,7 @@
                     </pic:cNvPicPr>
                   </pic:nvPicPr>
                   <pic:blipFill>
-                    <a:blip r:embed="rId16" cstate="print">
+                    <a:blip r:embed="rId17" cstate="print">
                       <a:extLst>
                         <a:ext uri="{28A0092B-C50C-407E-A947-70E740481C1C}">
                           <a14:useLocalDpi xmlns:a14="http://schemas.microsoft.com/office/drawing/2010/main" val="0"/>
@@ -1015,7 +1055,7 @@
           <w:noProof/>
         </w:rPr>
         <w:drawing>
-          <wp:inline distT="0" distB="0" distL="0" distR="0" wp14:anchorId="5B607486" wp14:editId="44558DC6">
+          <wp:inline distT="0" distB="0" distL="0" distR="0" wp14:anchorId="5B607486" wp14:editId="36238A76">
             <wp:extent cx="5274310" cy="1691005"/>
             <wp:effectExtent l="0" t="0" r="2540" b="4445"/>
             <wp:docPr id="547065552" name="图片 16"/>
@@ -1032,7 +1072,7 @@
                     </pic:cNvPicPr>
                   </pic:nvPicPr>
                   <pic:blipFill>
-                    <a:blip r:embed="rId17" cstate="print">
+                    <a:blip r:embed="rId18" cstate="print">
                       <a:extLst>
                         <a:ext uri="{28A0092B-C50C-407E-A947-70E740481C1C}">
                           <a14:useLocalDpi xmlns:a14="http://schemas.microsoft.com/office/drawing/2010/main" val="0"/>
@@ -1094,7 +1134,7 @@
                     </pic:cNvPicPr>
                   </pic:nvPicPr>
                   <pic:blipFill>
-                    <a:blip r:embed="rId18">
+                    <a:blip r:embed="rId19">
                       <a:extLst>
                         <a:ext uri="{28A0092B-C50C-407E-A947-70E740481C1C}">
                           <a14:useLocalDpi xmlns:a14="http://schemas.microsoft.com/office/drawing/2010/main" val="0"/>
@@ -1164,7 +1204,7 @@
           <w:noProof/>
         </w:rPr>
         <w:drawing>
-          <wp:inline distT="0" distB="0" distL="0" distR="0" wp14:anchorId="79FE5278" wp14:editId="518DB495">
+          <wp:inline distT="0" distB="0" distL="0" distR="0" wp14:anchorId="79FE5278" wp14:editId="0A09D456">
             <wp:extent cx="5274310" cy="2645410"/>
             <wp:effectExtent l="0" t="0" r="2540" b="2540"/>
             <wp:docPr id="963230575" name="图片 11"/>
@@ -1181,7 +1221,7 @@
                     </pic:cNvPicPr>
                   </pic:nvPicPr>
                   <pic:blipFill>
-                    <a:blip r:embed="rId19" cstate="print">
+                    <a:blip r:embed="rId20" cstate="print">
                       <a:extLst>
                         <a:ext uri="{28A0092B-C50C-407E-A947-70E740481C1C}">
                           <a14:useLocalDpi xmlns:a14="http://schemas.microsoft.com/office/drawing/2010/main" val="0"/>
@@ -1334,7 +1374,7 @@
           <w:noProof/>
         </w:rPr>
         <w:drawing>
-          <wp:inline distT="0" distB="0" distL="0" distR="0" wp14:anchorId="2A619EB3" wp14:editId="08D43F51">
+          <wp:inline distT="0" distB="0" distL="0" distR="0" wp14:anchorId="2A619EB3" wp14:editId="4966DBC4">
             <wp:extent cx="5274310" cy="2692400"/>
             <wp:effectExtent l="0" t="0" r="2540" b="0"/>
             <wp:docPr id="1882738907" name="图片 12"/>
@@ -1351,7 +1391,7 @@
                     </pic:cNvPicPr>
                   </pic:nvPicPr>
                   <pic:blipFill>
-                    <a:blip r:embed="rId20" cstate="print">
+                    <a:blip r:embed="rId21" cstate="print">
                       <a:extLst>
                         <a:ext uri="{28A0092B-C50C-407E-A947-70E740481C1C}">
                           <a14:useLocalDpi xmlns:a14="http://schemas.microsoft.com/office/drawing/2010/main" val="0"/>
@@ -1438,7 +1478,7 @@
         </w:rPr>
         <w:lastRenderedPageBreak/>
         <w:drawing>
-          <wp:inline distT="0" distB="0" distL="0" distR="0" wp14:anchorId="09499A9F" wp14:editId="55005546">
+          <wp:inline distT="0" distB="0" distL="0" distR="0" wp14:anchorId="09499A9F" wp14:editId="17D45FAB">
             <wp:extent cx="5274310" cy="2026920"/>
             <wp:effectExtent l="0" t="0" r="2540" b="0"/>
             <wp:docPr id="391436238" name="图片 14"/>
@@ -1455,7 +1495,7 @@
                     </pic:cNvPicPr>
                   </pic:nvPicPr>
                   <pic:blipFill>
-                    <a:blip r:embed="rId21" cstate="print">
+                    <a:blip r:embed="rId22" cstate="print">
                       <a:extLst>
                         <a:ext uri="{28A0092B-C50C-407E-A947-70E740481C1C}">
                           <a14:useLocalDpi xmlns:a14="http://schemas.microsoft.com/office/drawing/2010/main" val="0"/>
@@ -1523,7 +1563,7 @@
           <w:noProof/>
         </w:rPr>
         <w:drawing>
-          <wp:inline distT="0" distB="0" distL="0" distR="0" wp14:anchorId="092774A6" wp14:editId="036501BD">
+          <wp:inline distT="0" distB="0" distL="0" distR="0" wp14:anchorId="092774A6" wp14:editId="2416C01A">
             <wp:extent cx="5274310" cy="1661795"/>
             <wp:effectExtent l="0" t="0" r="2540" b="0"/>
             <wp:docPr id="1078915924" name="图片 15"/>
@@ -1540,7 +1580,7 @@
                     </pic:cNvPicPr>
                   </pic:nvPicPr>
                   <pic:blipFill>
-                    <a:blip r:embed="rId22" cstate="print">
+                    <a:blip r:embed="rId23" cstate="print">
                       <a:extLst>
                         <a:ext uri="{28A0092B-C50C-407E-A947-70E740481C1C}">
                           <a14:useLocalDpi xmlns:a14="http://schemas.microsoft.com/office/drawing/2010/main" val="0"/>
@@ -1635,7 +1675,7 @@
           <w:noProof/>
         </w:rPr>
         <w:drawing>
-          <wp:inline distT="0" distB="0" distL="0" distR="0" wp14:anchorId="4193F733" wp14:editId="55A05836">
+          <wp:inline distT="0" distB="0" distL="0" distR="0" wp14:anchorId="4193F733" wp14:editId="4DDCA0EF">
             <wp:extent cx="5274310" cy="1701165"/>
             <wp:effectExtent l="0" t="0" r="2540" b="0"/>
             <wp:docPr id="798661540" name="图片 8"/>
@@ -1652,7 +1692,7 @@
                     </pic:cNvPicPr>
                   </pic:nvPicPr>
                   <pic:blipFill>
-                    <a:blip r:embed="rId16" cstate="print">
+                    <a:blip r:embed="rId17" cstate="print">
                       <a:extLst>
                         <a:ext uri="{28A0092B-C50C-407E-A947-70E740481C1C}">
                           <a14:useLocalDpi xmlns:a14="http://schemas.microsoft.com/office/drawing/2010/main" val="0"/>
@@ -1715,7 +1755,7 @@
         </w:rPr>
         <w:lastRenderedPageBreak/>
         <w:drawing>
-          <wp:inline distT="0" distB="0" distL="0" distR="0" wp14:anchorId="22133340" wp14:editId="755B9642">
+          <wp:inline distT="0" distB="0" distL="0" distR="0" wp14:anchorId="22133340" wp14:editId="5E932418">
             <wp:extent cx="5274310" cy="2723515"/>
             <wp:effectExtent l="0" t="0" r="2540" b="635"/>
             <wp:docPr id="978661658" name="图片 1"/>
@@ -1732,7 +1772,7 @@
                     </pic:cNvPicPr>
                   </pic:nvPicPr>
                   <pic:blipFill>
-                    <a:blip r:embed="rId23" cstate="print">
+                    <a:blip r:embed="rId24" cstate="print">
                       <a:extLst>
                         <a:ext uri="{28A0092B-C50C-407E-A947-70E740481C1C}">
                           <a14:useLocalDpi xmlns:a14="http://schemas.microsoft.com/office/drawing/2010/main" val="0"/>
@@ -1812,7 +1852,7 @@
                     </pic:cNvPicPr>
                   </pic:nvPicPr>
                   <pic:blipFill>
-                    <a:blip r:embed="rId24">
+                    <a:blip r:embed="rId25">
                       <a:extLst>
                         <a:ext uri="{28A0092B-C50C-407E-A947-70E740481C1C}">
                           <a14:useLocalDpi xmlns:a14="http://schemas.microsoft.com/office/drawing/2010/main" val="0"/>
@@ -2034,7 +2074,7 @@
         </w:rPr>
         <w:lastRenderedPageBreak/>
         <w:drawing>
-          <wp:inline distT="0" distB="0" distL="0" distR="0" wp14:anchorId="1E5318E7" wp14:editId="3900F8F5">
+          <wp:inline distT="0" distB="0" distL="0" distR="0" wp14:anchorId="1E5318E7" wp14:editId="36470B8E">
             <wp:extent cx="3556861" cy="2354398"/>
             <wp:effectExtent l="0" t="0" r="5715" b="8255"/>
             <wp:docPr id="1760242829" name="图片 3"/>
@@ -2051,7 +2091,7 @@
                     </pic:cNvPicPr>
                   </pic:nvPicPr>
                   <pic:blipFill>
-                    <a:blip r:embed="rId25" cstate="print">
+                    <a:blip r:embed="rId26" cstate="print">
                       <a:extLst>
                         <a:ext uri="{28A0092B-C50C-407E-A947-70E740481C1C}">
                           <a14:useLocalDpi xmlns:a14="http://schemas.microsoft.com/office/drawing/2010/main" val="0"/>
@@ -2131,7 +2171,7 @@
                     </pic:cNvPicPr>
                   </pic:nvPicPr>
                   <pic:blipFill>
-                    <a:blip r:embed="rId26">
+                    <a:blip r:embed="rId27">
                       <a:extLst>
                         <a:ext uri="{28A0092B-C50C-407E-A947-70E740481C1C}">
                           <a14:useLocalDpi xmlns:a14="http://schemas.microsoft.com/office/drawing/2010/main" val="0"/>
@@ -2203,7 +2243,7 @@
                     </pic:cNvPicPr>
                   </pic:nvPicPr>
                   <pic:blipFill>
-                    <a:blip r:embed="rId27">
+                    <a:blip r:embed="rId28">
                       <a:extLst>
                         <a:ext uri="{28A0092B-C50C-407E-A947-70E740481C1C}">
                           <a14:useLocalDpi xmlns:a14="http://schemas.microsoft.com/office/drawing/2010/main" val="0"/>
@@ -2297,7 +2337,7 @@
                     </pic:cNvPicPr>
                   </pic:nvPicPr>
                   <pic:blipFill>
-                    <a:blip r:embed="rId28" cstate="print">
+                    <a:blip r:embed="rId29" cstate="print">
                       <a:extLst>
                         <a:ext uri="{28A0092B-C50C-407E-A947-70E740481C1C}">
                           <a14:useLocalDpi xmlns:a14="http://schemas.microsoft.com/office/drawing/2010/main" val="0"/>
@@ -2414,7 +2454,7 @@
                     </pic:cNvPicPr>
                   </pic:nvPicPr>
                   <pic:blipFill>
-                    <a:blip r:embed="rId29">
+                    <a:blip r:embed="rId30">
                       <a:extLst>
                         <a:ext uri="{28A0092B-C50C-407E-A947-70E740481C1C}">
                           <a14:useLocalDpi xmlns:a14="http://schemas.microsoft.com/office/drawing/2010/main" val="0"/>
@@ -2476,7 +2516,7 @@
                     </pic:cNvPicPr>
                   </pic:nvPicPr>
                   <pic:blipFill>
-                    <a:blip r:embed="rId30">
+                    <a:blip r:embed="rId31">
                       <a:extLst>
                         <a:ext uri="{28A0092B-C50C-407E-A947-70E740481C1C}">
                           <a14:useLocalDpi xmlns:a14="http://schemas.microsoft.com/office/drawing/2010/main" val="0"/>
@@ -2538,7 +2578,7 @@
                     </pic:cNvPicPr>
                   </pic:nvPicPr>
                   <pic:blipFill>
-                    <a:blip r:embed="rId31">
+                    <a:blip r:embed="rId32">
                       <a:extLst>
                         <a:ext uri="{28A0092B-C50C-407E-A947-70E740481C1C}">
                           <a14:useLocalDpi xmlns:a14="http://schemas.microsoft.com/office/drawing/2010/main" val="0"/>
@@ -2679,7 +2719,7 @@
                     </pic:cNvPicPr>
                   </pic:nvPicPr>
                   <pic:blipFill>
-                    <a:blip r:embed="rId32">
+                    <a:blip r:embed="rId33">
                       <a:extLst>
                         <a:ext uri="{28A0092B-C50C-407E-A947-70E740481C1C}">
                           <a14:useLocalDpi xmlns:a14="http://schemas.microsoft.com/office/drawing/2010/main" val="0"/>
@@ -2756,7 +2796,7 @@
                     </pic:cNvPicPr>
                   </pic:nvPicPr>
                   <pic:blipFill>
-                    <a:blip r:embed="rId33">
+                    <a:blip r:embed="rId34">
                       <a:extLst>
                         <a:ext uri="{28A0092B-C50C-407E-A947-70E740481C1C}">
                           <a14:useLocalDpi xmlns:a14="http://schemas.microsoft.com/office/drawing/2010/main" val="0"/>
@@ -4319,6 +4359,17 @@
       <w:szCs w:val="18"/>
     </w:rPr>
   </w:style>
+  <w:style w:type="character" w:styleId="af2">
+    <w:name w:val="Hyperlink"/>
+    <w:basedOn w:val="a0"/>
+    <w:uiPriority w:val="99"/>
+    <w:unhideWhenUsed/>
+    <w:rsid w:val="00253037"/>
+    <w:rPr>
+      <w:color w:val="0563C1" w:themeColor="hyperlink"/>
+      <w:u w:val="single"/>
+    </w:rPr>
+  </w:style>
 </w:styles>
 </file>
 

</xml_diff>